<commit_message>
chore: update diagnostic.docx template (manual edits)
Co-Authored-By: Claude Sonnet 4.6 <noreply@anthropic.com>
</commit_message>
<xml_diff>
--- a/plugins/edifice-mission-report/templates/ic-ingenieurs/diagnostic.docx
+++ b/plugins/edifice-mission-report/templates/ic-ingenieurs/diagnostic.docx
@@ -266,6 +266,8 @@
       </w:pPr>
     </w:p>
     <w:p/>
+    <w:p/>
+    <w:p/>
     <w:p>
       <w:pPr>
         <w:jc w:val="center"/>
@@ -294,6 +296,16 @@
       <w:r>
         <w:t>}</w:t>
       </w:r>
+    </w:p>
+    <w:p>
+      <w:pPr>
+        <w:jc w:val="center"/>
+      </w:pPr>
+    </w:p>
+    <w:p>
+      <w:pPr>
+        <w:jc w:val="center"/>
+      </w:pPr>
     </w:p>
     <w:p>
       <w:pPr>
@@ -474,9 +486,11 @@
               <w:bottom w:w="0" w:type="dxa"/>
               <w:right w:w="108" w:type="dxa"/>
             </w:tcMar>
+            <w:vAlign w:val="center"/>
           </w:tcPr>
           <w:p>
             <w:pPr>
+              <w:jc w:val="center"/>
               <w:rPr>
                 <w:lang w:eastAsia="zh-CN" w:bidi="hi-IN"/>
               </w:rPr>
@@ -513,9 +527,11 @@
               <w:bottom w:w="0" w:type="dxa"/>
               <w:right w:w="108" w:type="dxa"/>
             </w:tcMar>
+            <w:vAlign w:val="center"/>
           </w:tcPr>
           <w:p>
             <w:pPr>
+              <w:jc w:val="center"/>
               <w:rPr>
                 <w:lang w:eastAsia="zh-CN" w:bidi="hi-IN"/>
               </w:rPr>
@@ -544,9 +560,11 @@
               <w:bottom w:w="0" w:type="dxa"/>
               <w:right w:w="108" w:type="dxa"/>
             </w:tcMar>
+            <w:vAlign w:val="center"/>
           </w:tcPr>
           <w:p>
             <w:pPr>
+              <w:jc w:val="center"/>
               <w:rPr>
                 <w:lang w:eastAsia="zh-CN" w:bidi="hi-IN"/>
               </w:rPr>
@@ -557,9 +575,9 @@
                 <w:lang w:eastAsia="zh-CN" w:bidi="hi-IN"/>
               </w:rPr>
               <w:drawing>
-                <wp:inline distT="0" distB="0" distL="0" distR="0" wp14:anchorId="75D118C4" wp14:editId="71B01395">
-                  <wp:extent cx="434378" cy="342930"/>
-                  <wp:effectExtent l="0" t="0" r="3810" b="0"/>
+                <wp:inline distT="0" distB="0" distL="0" distR="0" wp14:anchorId="75D118C4" wp14:editId="4D04920E">
+                  <wp:extent cx="434340" cy="342900"/>
+                  <wp:effectExtent l="0" t="0" r="0" b="0"/>
                   <wp:docPr id="209800453" name="Image 1"/>
                   <wp:cNvGraphicFramePr>
                     <a:graphicFrameLocks xmlns:a="http://schemas.openxmlformats.org/drawingml/2006/main" noChangeAspect="1"/>
@@ -580,7 +598,7 @@
                         <pic:spPr>
                           <a:xfrm>
                             <a:off x="0" y="0"/>
-                            <a:ext cx="434378" cy="342930"/>
+                            <a:ext cx="434340" cy="342900"/>
                           </a:xfrm>
                           <a:prstGeom prst="rect">
                             <a:avLst/>
@@ -610,115 +628,11 @@
               <w:bottom w:w="0" w:type="dxa"/>
               <w:right w:w="108" w:type="dxa"/>
             </w:tcMar>
+            <w:vAlign w:val="center"/>
           </w:tcPr>
           <w:p>
             <w:pPr>
-              <w:rPr>
-                <w:lang w:eastAsia="zh-CN" w:bidi="hi-IN"/>
-              </w:rPr>
-            </w:pPr>
-          </w:p>
-        </w:tc>
-      </w:tr>
-      <w:tr>
-        <w:trPr>
-          <w:trHeight w:val="428"/>
-        </w:trPr>
-        <w:tc>
-          <w:tcPr>
-            <w:tcW w:w="1594" w:type="dxa"/>
-            <w:tcBorders>
-              <w:top w:val="single" w:sz="4" w:space="0" w:color="000001"/>
-              <w:left w:val="single" w:sz="4" w:space="0" w:color="000001"/>
-              <w:bottom w:val="single" w:sz="4" w:space="0" w:color="000001"/>
-              <w:right w:val="single" w:sz="4" w:space="0" w:color="000001"/>
-            </w:tcBorders>
-            <w:shd w:val="clear" w:color="auto" w:fill="FFFFFF"/>
-            <w:tcMar>
-              <w:top w:w="0" w:type="dxa"/>
-              <w:left w:w="108" w:type="dxa"/>
-              <w:bottom w:w="0" w:type="dxa"/>
-              <w:right w:w="108" w:type="dxa"/>
-            </w:tcMar>
-          </w:tcPr>
-          <w:p>
-            <w:pPr>
-              <w:rPr>
-                <w:lang w:eastAsia="zh-CN" w:bidi="hi-IN"/>
-              </w:rPr>
-            </w:pPr>
-          </w:p>
-        </w:tc>
-        <w:tc>
-          <w:tcPr>
-            <w:tcW w:w="1981" w:type="dxa"/>
-            <w:tcBorders>
-              <w:top w:val="single" w:sz="4" w:space="0" w:color="000001"/>
-              <w:left w:val="single" w:sz="4" w:space="0" w:color="000001"/>
-              <w:bottom w:val="single" w:sz="4" w:space="0" w:color="000001"/>
-              <w:right w:val="single" w:sz="4" w:space="0" w:color="000001"/>
-            </w:tcBorders>
-            <w:shd w:val="clear" w:color="auto" w:fill="FFFFFF"/>
-            <w:tcMar>
-              <w:top w:w="0" w:type="dxa"/>
-              <w:left w:w="108" w:type="dxa"/>
-              <w:bottom w:w="0" w:type="dxa"/>
-              <w:right w:w="108" w:type="dxa"/>
-            </w:tcMar>
-          </w:tcPr>
-          <w:p>
-            <w:pPr>
-              <w:rPr>
-                <w:lang w:eastAsia="zh-CN" w:bidi="hi-IN"/>
-              </w:rPr>
-            </w:pPr>
-          </w:p>
-        </w:tc>
-        <w:tc>
-          <w:tcPr>
-            <w:tcW w:w="1764" w:type="dxa"/>
-            <w:tcBorders>
-              <w:top w:val="single" w:sz="4" w:space="0" w:color="000001"/>
-              <w:left w:val="single" w:sz="4" w:space="0" w:color="000001"/>
-              <w:bottom w:val="single" w:sz="4" w:space="0" w:color="000001"/>
-              <w:right w:val="single" w:sz="4" w:space="0" w:color="000001"/>
-            </w:tcBorders>
-            <w:shd w:val="clear" w:color="auto" w:fill="FFFFFF"/>
-            <w:tcMar>
-              <w:top w:w="0" w:type="dxa"/>
-              <w:left w:w="108" w:type="dxa"/>
-              <w:bottom w:w="0" w:type="dxa"/>
-              <w:right w:w="108" w:type="dxa"/>
-            </w:tcMar>
-          </w:tcPr>
-          <w:p>
-            <w:pPr>
-              <w:rPr>
-                <w:noProof/>
-                <w:lang w:bidi="hi-IN"/>
-              </w:rPr>
-            </w:pPr>
-          </w:p>
-        </w:tc>
-        <w:tc>
-          <w:tcPr>
-            <w:tcW w:w="2917" w:type="dxa"/>
-            <w:tcBorders>
-              <w:top w:val="single" w:sz="4" w:space="0" w:color="000001"/>
-              <w:left w:val="single" w:sz="4" w:space="0" w:color="000001"/>
-              <w:bottom w:val="single" w:sz="4" w:space="0" w:color="000001"/>
-              <w:right w:val="single" w:sz="4" w:space="0" w:color="000001"/>
-            </w:tcBorders>
-            <w:shd w:val="clear" w:color="auto" w:fill="FFFFFF"/>
-            <w:tcMar>
-              <w:top w:w="0" w:type="dxa"/>
-              <w:left w:w="108" w:type="dxa"/>
-              <w:bottom w:w="0" w:type="dxa"/>
-              <w:right w:w="108" w:type="dxa"/>
-            </w:tcMar>
-          </w:tcPr>
-          <w:p>
-            <w:pPr>
+              <w:jc w:val="center"/>
               <w:rPr>
                 <w:lang w:eastAsia="zh-CN" w:bidi="hi-IN"/>
               </w:rPr>
@@ -727,11 +641,12 @@
         </w:tc>
       </w:tr>
     </w:tbl>
-    <w:p>
-      <w:r>
-        <w:tab/>
-      </w:r>
-    </w:p>
+    <w:p/>
+    <w:p/>
+    <w:p/>
+    <w:p/>
+    <w:p/>
+    <w:p/>
     <w:p/>
     <w:p/>
     <w:p/>
@@ -740,14 +655,51 @@
     <w:p/>
     <w:p>
       <w:r>
+        <w:tab/>
+      </w:r>
+    </w:p>
+    <w:p>
+      <w:pPr>
+        <w:pBdr>
+          <w:bottom w:val="single" w:sz="6" w:space="1" w:color="auto"/>
+        </w:pBdr>
+      </w:pPr>
+    </w:p>
+    <w:p>
+      <w:pPr>
+        <w:sectPr>
+          <w:headerReference w:type="even" r:id="rId9"/>
+          <w:headerReference w:type="default" r:id="rId10"/>
+          <w:footerReference w:type="even" r:id="rId11"/>
+          <w:footerReference w:type="default" r:id="rId12"/>
+          <w:headerReference w:type="first" r:id="rId13"/>
+          <w:footerReference w:type="first" r:id="rId14"/>
+          <w:pgSz w:w="11906" w:h="16838"/>
+          <w:pgMar w:top="1417" w:right="1417" w:bottom="1417" w:left="1417" w:header="708" w:footer="708" w:gutter="0"/>
+          <w:cols w:space="708"/>
+          <w:docGrid w:linePitch="360"/>
+        </w:sectPr>
+      </w:pPr>
+    </w:p>
+    <w:p>
+      <w:r>
         <w:rPr>
           <w:noProof/>
+          <w14:ligatures w14:val="standardContextual"/>
         </w:rPr>
         <w:drawing>
-          <wp:inline distT="0" distB="0" distL="0" distR="0" wp14:anchorId="397349E0" wp14:editId="16E5DF82">
-            <wp:extent cx="5759450" cy="1308735"/>
+          <wp:anchor distT="0" distB="0" distL="114300" distR="114300" simplePos="0" relativeHeight="251658240" behindDoc="0" locked="0" layoutInCell="1" allowOverlap="1" wp14:anchorId="50764A80" wp14:editId="6588E4C0">
+            <wp:simplePos x="0" y="0"/>
+            <wp:positionH relativeFrom="column">
+              <wp:posOffset>-5080</wp:posOffset>
+            </wp:positionH>
+            <wp:positionV relativeFrom="paragraph">
+              <wp:posOffset>96174</wp:posOffset>
+            </wp:positionV>
+            <wp:extent cx="943200" cy="795600"/>
             <wp:effectExtent l="0" t="0" r="0" b="0"/>
-            <wp:docPr id="2082468033" name="Image 1" descr="Une image contenant texte, capture d’écran, Police&#10;&#10;Description générée automatiquement"/>
+            <wp:wrapSquare wrapText="bothSides"/>
+            <wp:docPr id="1115233594" name="Image 1"/>
             <wp:cNvGraphicFramePr>
               <a:graphicFrameLocks xmlns:a="http://schemas.openxmlformats.org/drawingml/2006/main" noChangeAspect="1"/>
             </wp:cNvGraphicFramePr>
@@ -755,36 +707,115 @@
               <a:graphicData uri="http://schemas.openxmlformats.org/drawingml/2006/picture">
                 <pic:pic xmlns:pic="http://schemas.openxmlformats.org/drawingml/2006/picture">
                   <pic:nvPicPr>
-                    <pic:cNvPr id="2082468033" name="Image 1" descr="Une image contenant texte, capture d’écran, Police&#10;&#10;Description générée automatiquement"/>
+                    <pic:cNvPr id="1115233594" name="Image 1115233594"/>
                     <pic:cNvPicPr/>
                   </pic:nvPicPr>
-                  <pic:blipFill>
-                    <a:blip r:embed="rId9"/>
+                  <pic:blipFill rotWithShape="1">
+                    <a:blip r:embed="rId15" cstate="print">
+                      <a:extLst>
+                        <a:ext uri="{28A0092B-C50C-407E-A947-70E740481C1C}">
+                          <a14:useLocalDpi xmlns:a14="http://schemas.microsoft.com/office/drawing/2010/main" val="0"/>
+                        </a:ext>
+                      </a:extLst>
+                    </a:blip>
+                    <a:srcRect t="7652" b="8178"/>
                     <a:stretch>
                       <a:fillRect/>
                     </a:stretch>
                   </pic:blipFill>
-                  <pic:spPr>
+                  <pic:spPr bwMode="auto">
                     <a:xfrm>
                       <a:off x="0" y="0"/>
-                      <a:ext cx="5759450" cy="1308735"/>
+                      <a:ext cx="943200" cy="795600"/>
                     </a:xfrm>
                     <a:prstGeom prst="rect">
                       <a:avLst/>
                     </a:prstGeom>
+                    <a:ln>
+                      <a:noFill/>
+                    </a:ln>
+                    <a:extLst>
+                      <a:ext uri="{53640926-AAD7-44D8-BBD7-CCE9431645EC}">
+                        <a14:shadowObscured xmlns:a14="http://schemas.microsoft.com/office/drawing/2010/main"/>
+                      </a:ext>
+                    </a:extLst>
                   </pic:spPr>
                 </pic:pic>
               </a:graphicData>
             </a:graphic>
-          </wp:inline>
+            <wp14:sizeRelH relativeFrom="margin">
+              <wp14:pctWidth>0</wp14:pctWidth>
+            </wp14:sizeRelH>
+            <wp14:sizeRelV relativeFrom="margin">
+              <wp14:pctHeight>0</wp14:pctHeight>
+            </wp14:sizeRelV>
+          </wp:anchor>
         </w:drawing>
+      </w:r>
+    </w:p>
+    <w:p/>
+    <w:p>
+      <w:r>
+        <w:t>I.C. Ingénieurs Conseils</w:t>
+      </w:r>
+    </w:p>
+    <w:p/>
+    <w:p/>
+    <w:p>
+      <w:r>
+        <w:br w:type="column"/>
       </w:r>
     </w:p>
     <w:p>
       <w:r>
-        <w:br w:type="page"/>
+        <w:t>143 bd de Magenta 75010 Paris</w:t>
       </w:r>
     </w:p>
+    <w:p>
+      <w:r>
+        <w:fldChar w:fldCharType="begin"/>
+      </w:r>
+      <w:r>
+        <w:instrText>HYPERLINK "mailto:</w:instrText>
+      </w:r>
+      <w:r>
+        <w:instrText>delaby.la@gmail.com</w:instrText>
+      </w:r>
+      <w:r>
+        <w:instrText>"</w:instrText>
+      </w:r>
+      <w:r>
+        <w:fldChar w:fldCharType="separate"/>
+      </w:r>
+      <w:r>
+        <w:rPr>
+          <w:rStyle w:val="Lienhypertexte"/>
+        </w:rPr>
+        <w:t>delaby.la@gmail.com</w:t>
+      </w:r>
+      <w:r>
+        <w:fldChar w:fldCharType="end"/>
+      </w:r>
+    </w:p>
+    <w:p>
+      <w:r>
+        <w:t>06 83 16 89 96</w:t>
+      </w:r>
+    </w:p>
+    <w:p/>
+    <w:p/>
+    <w:p>
+      <w:pPr>
+        <w:sectPr>
+          <w:type w:val="continuous"/>
+          <w:pgSz w:w="11906" w:h="16838"/>
+          <w:pgMar w:top="1417" w:right="1417" w:bottom="1417" w:left="1417" w:header="708" w:footer="708" w:gutter="0"/>
+          <w:cols w:num="2" w:space="708"/>
+          <w:docGrid w:linePitch="360"/>
+        </w:sectPr>
+      </w:pPr>
+    </w:p>
+    <w:p/>
     <w:sdt>
       <w:sdtPr>
         <w:rPr>
@@ -2379,7 +2410,6 @@
     <w:p>
       <w:pPr>
         <w:pStyle w:val="Titre1"/>
-        <w:spacing w:before="48" w:after="48"/>
         <w:rPr>
           <w:rFonts w:eastAsia="Times New Roman"/>
         </w:rPr>
@@ -2477,7 +2507,7 @@
                     <pic:cNvPicPr/>
                   </pic:nvPicPr>
                   <pic:blipFill>
-                    <a:blip r:embed="rId10">
+                    <a:blip r:embed="rId16">
                       <a:extLst>
                         <a:ext uri="{28A0092B-C50C-407E-A947-70E740481C1C}">
                           <a14:useLocalDpi xmlns:a14="http://schemas.microsoft.com/office/drawing/2010/main" val="0"/>
@@ -2543,7 +2573,6 @@
     <w:p>
       <w:pPr>
         <w:pStyle w:val="Titre1"/>
-        <w:spacing w:before="48" w:after="48"/>
         <w:rPr>
           <w:rFonts w:eastAsia="Times New Roman"/>
         </w:rPr>
@@ -2699,7 +2728,6 @@
     <w:p>
       <w:pPr>
         <w:pStyle w:val="Titre1"/>
-        <w:spacing w:before="48" w:after="48"/>
         <w:rPr>
           <w:rFonts w:eastAsia="Times New Roman"/>
         </w:rPr>
@@ -2964,7 +2992,7 @@
                     <pic:cNvPicPr/>
                   </pic:nvPicPr>
                   <pic:blipFill>
-                    <a:blip r:embed="rId11"/>
+                    <a:blip r:embed="rId17"/>
                     <a:stretch>
                       <a:fillRect/>
                     </a:stretch>
@@ -3029,7 +3057,7 @@
                     <pic:cNvPicPr/>
                   </pic:nvPicPr>
                   <pic:blipFill>
-                    <a:blip r:embed="rId12"/>
+                    <a:blip r:embed="rId18"/>
                     <a:stretch>
                       <a:fillRect/>
                     </a:stretch>
@@ -3115,13 +3143,11 @@
     <w:p>
       <w:pPr>
         <w:pStyle w:val="Titre1"/>
-        <w:spacing w:before="48" w:after="48"/>
         <w:rPr>
           <w:rFonts w:eastAsia="Times New Roman"/>
         </w:rPr>
       </w:pPr>
       <w:bookmarkStart w:id="47" w:name="_Toc216726474"/>
-      <w:bookmarkStart w:id="48" w:name="_Hlk207709636"/>
       <w:r>
         <w:rPr>
           <w:rFonts w:eastAsia="Times New Roman"/>
@@ -3136,19 +3162,47 @@
         <w:pStyle w:val="Titre2"/>
         <w:spacing w:before="48" w:after="48"/>
       </w:pPr>
-      <w:bookmarkStart w:id="49" w:name="_Toc216726475"/>
+      <w:bookmarkStart w:id="48" w:name="_Toc216726475"/>
       <w:r>
         <w:t>Visites terrains</w:t>
       </w:r>
       <w:r>
         <w:t xml:space="preserve"> réalisés</w:t>
+      </w:r>
+      <w:bookmarkEnd w:id="48"/>
+    </w:p>
+    <w:p>
+      <w:proofErr w:type="gramStart"/>
+      <w:r>
+        <w:t>{{ detail</w:t>
+      </w:r>
+      <w:proofErr w:type="gramEnd"/>
+      <w:r>
+        <w:t>_</w:t>
+      </w:r>
+      <w:proofErr w:type="gramStart"/>
+      <w:r>
+        <w:t>visite }</w:t>
+      </w:r>
+      <w:proofErr w:type="gramEnd"/>
+      <w:r>
+        <w:t>}</w:t>
+      </w:r>
+    </w:p>
+    <w:p>
+      <w:pPr>
+        <w:pStyle w:val="Titre2"/>
+      </w:pPr>
+      <w:bookmarkStart w:id="49" w:name="_Toc216726476"/>
+      <w:r>
+        <w:t>Moyens mis en œuvre</w:t>
       </w:r>
       <w:bookmarkEnd w:id="49"/>
     </w:p>
     <w:p>
       <w:proofErr w:type="gramStart"/>
       <w:r>
-        <w:t>{{ detail</w:t>
+        <w:t>{{ investigation</w:t>
       </w:r>
       <w:proofErr w:type="gramEnd"/>
       <w:r>
@@ -3156,7 +3210,7 @@
       </w:r>
       <w:proofErr w:type="gramStart"/>
       <w:r>
-        <w:t>visite }</w:t>
+        <w:t>methods }</w:t>
       </w:r>
       <w:proofErr w:type="gramEnd"/>
       <w:r>
@@ -3166,43 +3220,15 @@
     <w:p>
       <w:pPr>
         <w:pStyle w:val="Titre2"/>
-      </w:pPr>
-      <w:bookmarkStart w:id="50" w:name="_Toc216726476"/>
-      <w:r>
-        <w:t>Moyens mis en œuvre</w:t>
+        <w:spacing w:before="48" w:after="48"/>
+      </w:pPr>
+      <w:bookmarkStart w:id="50" w:name="_Toc216726477"/>
+      <w:r>
+        <w:t>Indice d’état</w:t>
       </w:r>
       <w:bookmarkEnd w:id="50"/>
     </w:p>
     <w:p>
-      <w:proofErr w:type="gramStart"/>
-      <w:r>
-        <w:t>{{ investigation</w:t>
-      </w:r>
-      <w:proofErr w:type="gramEnd"/>
-      <w:r>
-        <w:t>_</w:t>
-      </w:r>
-      <w:proofErr w:type="gramStart"/>
-      <w:r>
-        <w:t>methods }</w:t>
-      </w:r>
-      <w:proofErr w:type="gramEnd"/>
-      <w:r>
-        <w:t>}</w:t>
-      </w:r>
-    </w:p>
-    <w:p>
-      <w:pPr>
-        <w:pStyle w:val="Titre2"/>
-        <w:spacing w:before="48" w:after="48"/>
-      </w:pPr>
-      <w:bookmarkStart w:id="51" w:name="_Toc216726477"/>
-      <w:r>
-        <w:t>Indice d’état</w:t>
-      </w:r>
-      <w:bookmarkEnd w:id="51"/>
-    </w:p>
-    <w:p>
       <w:r>
         <w:t xml:space="preserve">Pour réaliser ce diagnostic structurel nous nous sommes </w:t>
       </w:r>
@@ -3213,13 +3239,8 @@
         <w:t xml:space="preserve"> de l</w:t>
       </w:r>
       <w:r>
-        <w:t xml:space="preserve">a méthode dite des Visites Simplifiées Comparées (méthode VSC), développée par le </w:t>
-      </w:r>
-      <w:proofErr w:type="spellStart"/>
-      <w:r>
-        <w:t>Cerema</w:t>
-      </w:r>
-      <w:proofErr w:type="spellEnd"/>
+        <w:t>a méthode dite des Visites Simplifiées Comparées (méthode VSC), développée par le Cerema</w:t>
+      </w:r>
       <w:r>
         <w:t>.</w:t>
       </w:r>
@@ -3242,6 +3263,7 @@
           <w:ilvl w:val="0"/>
           <w:numId w:val="4"/>
         </w:numPr>
+        <w:ind w:left="426"/>
       </w:pPr>
       <w:r>
         <w:t>D’identifier</w:t>
@@ -3263,6 +3285,7 @@
           <w:ilvl w:val="0"/>
           <w:numId w:val="4"/>
         </w:numPr>
+        <w:ind w:left="426"/>
       </w:pPr>
       <w:r>
         <w:t>D’établir</w:t>
@@ -3289,6 +3312,7 @@
           <w:ilvl w:val="0"/>
           <w:numId w:val="5"/>
         </w:numPr>
+        <w:ind w:left="426"/>
       </w:pPr>
       <w:r>
         <w:t>Un</w:t>
@@ -3304,6 +3328,7 @@
           <w:ilvl w:val="0"/>
           <w:numId w:val="5"/>
         </w:numPr>
+        <w:ind w:left="426"/>
       </w:pPr>
       <w:r>
         <w:t>Un</w:t>
@@ -3319,6 +3344,7 @@
           <w:ilvl w:val="0"/>
           <w:numId w:val="5"/>
         </w:numPr>
+        <w:ind w:left="426"/>
       </w:pPr>
       <w:r>
         <w:t>Un</w:t>
@@ -3360,12 +3386,12 @@
         <w:tblLook w:val="04A0" w:firstRow="1" w:lastRow="0" w:firstColumn="1" w:lastColumn="0" w:noHBand="0" w:noVBand="1"/>
       </w:tblPr>
       <w:tblGrid>
-        <w:gridCol w:w="723"/>
-        <w:gridCol w:w="2180"/>
+        <w:gridCol w:w="562"/>
+        <w:gridCol w:w="2341"/>
         <w:gridCol w:w="2195"/>
         <w:gridCol w:w="1701"/>
-        <w:gridCol w:w="911"/>
-        <w:gridCol w:w="1352"/>
+        <w:gridCol w:w="993"/>
+        <w:gridCol w:w="1270"/>
       </w:tblGrid>
       <w:tr>
         <w:trPr>
@@ -3374,13 +3400,13 @@
         <w:tc>
           <w:tcPr>
             <w:cnfStyle w:val="001000000000" w:firstRow="0" w:lastRow="0" w:firstColumn="1" w:lastColumn="0" w:oddVBand="0" w:evenVBand="0" w:oddHBand="0" w:evenHBand="0" w:firstRowFirstColumn="0" w:firstRowLastColumn="0" w:lastRowFirstColumn="0" w:lastRowLastColumn="0"/>
-            <w:tcW w:w="723" w:type="dxa"/>
+            <w:tcW w:w="562" w:type="dxa"/>
           </w:tcPr>
           <w:p/>
         </w:tc>
         <w:tc>
           <w:tcPr>
-            <w:tcW w:w="4375" w:type="dxa"/>
+            <w:tcW w:w="4536" w:type="dxa"/>
             <w:gridSpan w:val="2"/>
           </w:tcPr>
           <w:p>
@@ -3411,7 +3437,7 @@
         <w:tc>
           <w:tcPr>
             <w:cnfStyle w:val="001000000000" w:firstRow="0" w:lastRow="0" w:firstColumn="1" w:lastColumn="0" w:oddVBand="0" w:evenVBand="0" w:oddHBand="0" w:evenHBand="0" w:firstRowFirstColumn="0" w:firstRowLastColumn="0" w:lastRowFirstColumn="0" w:lastRowLastColumn="0"/>
-            <w:tcW w:w="723" w:type="dxa"/>
+            <w:tcW w:w="562" w:type="dxa"/>
           </w:tcPr>
           <w:p>
             <w:r>
@@ -3421,7 +3447,7 @@
         </w:tc>
         <w:tc>
           <w:tcPr>
-            <w:tcW w:w="2180" w:type="dxa"/>
+            <w:tcW w:w="2341" w:type="dxa"/>
           </w:tcPr>
           <w:p>
             <w:pPr>
@@ -3460,7 +3486,7 @@
         </w:tc>
         <w:tc>
           <w:tcPr>
-            <w:tcW w:w="911" w:type="dxa"/>
+            <w:tcW w:w="993" w:type="dxa"/>
           </w:tcPr>
           <w:p>
             <w:pPr>
@@ -3473,7 +3499,7 @@
         </w:tc>
         <w:tc>
           <w:tcPr>
-            <w:tcW w:w="1352" w:type="dxa"/>
+            <w:tcW w:w="1270" w:type="dxa"/>
           </w:tcPr>
           <w:p>
             <w:pPr>
@@ -3489,7 +3515,7 @@
         <w:tc>
           <w:tcPr>
             <w:cnfStyle w:val="001000000000" w:firstRow="0" w:lastRow="0" w:firstColumn="1" w:lastColumn="0" w:oddVBand="0" w:evenVBand="0" w:oddHBand="0" w:evenHBand="0" w:firstRowFirstColumn="0" w:firstRowLastColumn="0" w:lastRowFirstColumn="0" w:lastRowLastColumn="0"/>
-            <w:tcW w:w="723" w:type="dxa"/>
+            <w:tcW w:w="562" w:type="dxa"/>
             <w:shd w:val="clear" w:color="auto" w:fill="EE0000"/>
             <w:vAlign w:val="center"/>
           </w:tcPr>
@@ -3501,7 +3527,7 @@
         </w:tc>
         <w:tc>
           <w:tcPr>
-            <w:tcW w:w="2180" w:type="dxa"/>
+            <w:tcW w:w="2341" w:type="dxa"/>
             <w:vAlign w:val="center"/>
           </w:tcPr>
           <w:p>
@@ -3529,7 +3555,7 @@
         </w:tc>
         <w:tc>
           <w:tcPr>
-            <w:tcW w:w="2612" w:type="dxa"/>
+            <w:tcW w:w="2694" w:type="dxa"/>
             <w:gridSpan w:val="2"/>
             <w:vAlign w:val="center"/>
           </w:tcPr>
@@ -3544,7 +3570,7 @@
         </w:tc>
         <w:tc>
           <w:tcPr>
-            <w:tcW w:w="1352" w:type="dxa"/>
+            <w:tcW w:w="1270" w:type="dxa"/>
             <w:vAlign w:val="center"/>
           </w:tcPr>
           <w:p>
@@ -3561,7 +3587,7 @@
         <w:tc>
           <w:tcPr>
             <w:cnfStyle w:val="001000000000" w:firstRow="0" w:lastRow="0" w:firstColumn="1" w:lastColumn="0" w:oddVBand="0" w:evenVBand="0" w:oddHBand="0" w:evenHBand="0" w:firstRowFirstColumn="0" w:firstRowLastColumn="0" w:lastRowFirstColumn="0" w:lastRowLastColumn="0"/>
-            <w:tcW w:w="723" w:type="dxa"/>
+            <w:tcW w:w="562" w:type="dxa"/>
             <w:shd w:val="clear" w:color="auto" w:fill="FFC000"/>
             <w:vAlign w:val="center"/>
           </w:tcPr>
@@ -3573,7 +3599,7 @@
         </w:tc>
         <w:tc>
           <w:tcPr>
-            <w:tcW w:w="2180" w:type="dxa"/>
+            <w:tcW w:w="2341" w:type="dxa"/>
             <w:vAlign w:val="center"/>
           </w:tcPr>
           <w:p>
@@ -3621,7 +3647,7 @@
         </w:tc>
         <w:tc>
           <w:tcPr>
-            <w:tcW w:w="911" w:type="dxa"/>
+            <w:tcW w:w="993" w:type="dxa"/>
             <w:vAlign w:val="center"/>
           </w:tcPr>
           <w:p>
@@ -3635,7 +3661,7 @@
         </w:tc>
         <w:tc>
           <w:tcPr>
-            <w:tcW w:w="1352" w:type="dxa"/>
+            <w:tcW w:w="1270" w:type="dxa"/>
             <w:vAlign w:val="center"/>
           </w:tcPr>
           <w:p>
@@ -3652,7 +3678,7 @@
         <w:tc>
           <w:tcPr>
             <w:cnfStyle w:val="001000000000" w:firstRow="0" w:lastRow="0" w:firstColumn="1" w:lastColumn="0" w:oddVBand="0" w:evenVBand="0" w:oddHBand="0" w:evenHBand="0" w:firstRowFirstColumn="0" w:firstRowLastColumn="0" w:lastRowFirstColumn="0" w:lastRowLastColumn="0"/>
-            <w:tcW w:w="723" w:type="dxa"/>
+            <w:tcW w:w="562" w:type="dxa"/>
             <w:shd w:val="clear" w:color="auto" w:fill="FFFF00"/>
             <w:vAlign w:val="center"/>
           </w:tcPr>
@@ -3664,7 +3690,7 @@
         </w:tc>
         <w:tc>
           <w:tcPr>
-            <w:tcW w:w="2180" w:type="dxa"/>
+            <w:tcW w:w="2341" w:type="dxa"/>
             <w:vAlign w:val="center"/>
           </w:tcPr>
           <w:p>
@@ -3706,7 +3732,7 @@
         </w:tc>
         <w:tc>
           <w:tcPr>
-            <w:tcW w:w="911" w:type="dxa"/>
+            <w:tcW w:w="993" w:type="dxa"/>
             <w:vMerge w:val="restart"/>
             <w:vAlign w:val="center"/>
           </w:tcPr>
@@ -3726,7 +3752,7 @@
         </w:tc>
         <w:tc>
           <w:tcPr>
-            <w:tcW w:w="1352" w:type="dxa"/>
+            <w:tcW w:w="1270" w:type="dxa"/>
             <w:vAlign w:val="center"/>
           </w:tcPr>
           <w:p>
@@ -3743,7 +3769,7 @@
         <w:tc>
           <w:tcPr>
             <w:cnfStyle w:val="001000000000" w:firstRow="0" w:lastRow="0" w:firstColumn="1" w:lastColumn="0" w:oddVBand="0" w:evenVBand="0" w:oddHBand="0" w:evenHBand="0" w:firstRowFirstColumn="0" w:firstRowLastColumn="0" w:lastRowFirstColumn="0" w:lastRowLastColumn="0"/>
-            <w:tcW w:w="723" w:type="dxa"/>
+            <w:tcW w:w="562" w:type="dxa"/>
             <w:shd w:val="clear" w:color="auto" w:fill="92D050"/>
             <w:vAlign w:val="center"/>
           </w:tcPr>
@@ -3755,7 +3781,7 @@
         </w:tc>
         <w:tc>
           <w:tcPr>
-            <w:tcW w:w="2180" w:type="dxa"/>
+            <w:tcW w:w="2341" w:type="dxa"/>
             <w:vAlign w:val="center"/>
           </w:tcPr>
           <w:p>
@@ -3797,7 +3823,7 @@
         </w:tc>
         <w:tc>
           <w:tcPr>
-            <w:tcW w:w="911" w:type="dxa"/>
+            <w:tcW w:w="993" w:type="dxa"/>
             <w:vMerge/>
             <w:vAlign w:val="center"/>
           </w:tcPr>
@@ -3809,7 +3835,7 @@
         </w:tc>
         <w:tc>
           <w:tcPr>
-            <w:tcW w:w="1352" w:type="dxa"/>
+            <w:tcW w:w="1270" w:type="dxa"/>
             <w:vAlign w:val="center"/>
           </w:tcPr>
           <w:p>
@@ -3829,7 +3855,7 @@
         <w:tc>
           <w:tcPr>
             <w:cnfStyle w:val="001000000000" w:firstRow="0" w:lastRow="0" w:firstColumn="1" w:lastColumn="0" w:oddVBand="0" w:evenVBand="0" w:oddHBand="0" w:evenHBand="0" w:firstRowFirstColumn="0" w:firstRowLastColumn="0" w:lastRowFirstColumn="0" w:lastRowLastColumn="0"/>
-            <w:tcW w:w="723" w:type="dxa"/>
+            <w:tcW w:w="562" w:type="dxa"/>
             <w:shd w:val="clear" w:color="auto" w:fill="00B0F0"/>
           </w:tcPr>
           <w:p>
@@ -3840,7 +3866,7 @@
         </w:tc>
         <w:tc>
           <w:tcPr>
-            <w:tcW w:w="8339" w:type="dxa"/>
+            <w:tcW w:w="8500" w:type="dxa"/>
             <w:gridSpan w:val="5"/>
           </w:tcPr>
           <w:p>
@@ -3858,12 +3884,6 @@
     <w:p>
       <w:pPr>
         <w:sectPr>
-          <w:headerReference w:type="even" r:id="rId13"/>
-          <w:headerReference w:type="default" r:id="rId14"/>
-          <w:footerReference w:type="even" r:id="rId15"/>
-          <w:footerReference w:type="default" r:id="rId16"/>
-          <w:headerReference w:type="first" r:id="rId17"/>
-          <w:footerReference w:type="first" r:id="rId18"/>
           <w:pgSz w:w="11906" w:h="16838"/>
           <w:pgMar w:top="1417" w:right="1417" w:bottom="1417" w:left="1417" w:header="708" w:footer="708" w:gutter="0"/>
           <w:cols w:space="708"/>
@@ -3876,75 +3896,175 @@
         <w:pStyle w:val="Titre1"/>
       </w:pPr>
       <w:r>
+        <w:lastRenderedPageBreak/>
         <w:t>Observations et désordres</w:t>
+      </w:r>
+    </w:p>
+    <w:p>
+      <w:r>
+        <w:t xml:space="preserve">{%tr for d in </w:t>
+      </w:r>
+      <w:proofErr w:type="spellStart"/>
+      <w:r>
+        <w:t>disorders</w:t>
+      </w:r>
+      <w:proofErr w:type="spellEnd"/>
+      <w:r>
+        <w:t xml:space="preserve"> %}</w:t>
+      </w:r>
+    </w:p>
+    <w:p>
+      <w:pPr>
+        <w:pStyle w:val="Titre2"/>
+      </w:pPr>
+      <w:proofErr w:type="gramStart"/>
+      <w:r>
+        <w:t xml:space="preserve">{{ </w:t>
+      </w:r>
+      <w:proofErr w:type="spellStart"/>
+      <w:r>
+        <w:t>d.ref</w:t>
+      </w:r>
+      <w:proofErr w:type="spellEnd"/>
+      <w:proofErr w:type="gramEnd"/>
+      <w:r>
+        <w:t xml:space="preserve"> </w:t>
+      </w:r>
+      <w:proofErr w:type="gramStart"/>
+      <w:r>
+        <w:t>}}  –</w:t>
+      </w:r>
+      <w:proofErr w:type="gramEnd"/>
+      <w:r>
+        <w:t xml:space="preserve">  </w:t>
+      </w:r>
+      <w:proofErr w:type="gramStart"/>
+      <w:r>
+        <w:t>{{ d</w:t>
+      </w:r>
+      <w:proofErr w:type="gramEnd"/>
+      <w:r>
+        <w:t>.</w:t>
+      </w:r>
+      <w:proofErr w:type="gramStart"/>
+      <w:r>
+        <w:t>name }</w:t>
+      </w:r>
+      <w:proofErr w:type="gramEnd"/>
+      <w:r>
+        <w:t>}</w:t>
       </w:r>
     </w:p>
     <w:tbl>
       <w:tblPr>
         <w:tblStyle w:val="Grilledutableau"/>
-        <w:tblW w:type="auto" w:w="0"/>
-        <w:tblLook w:firstColumn="1" w:firstRow="1" w:lastColumn="0" w:lastRow="0" w:noHBand="0" w:noVBand="1" w:val="04A0"/>
+        <w:tblW w:w="0" w:type="auto"/>
+        <w:tblLook w:val="04A0" w:firstRow="1" w:lastRow="0" w:firstColumn="1" w:lastColumn="0" w:noHBand="0" w:noVBand="1"/>
       </w:tblPr>
       <w:tblGrid>
-        <w:gridCol w:w="4536"/>
-        <w:gridCol w:w="4536"/>
+        <w:gridCol w:w="4531"/>
+        <w:gridCol w:w="4531"/>
       </w:tblGrid>
       <w:tr>
-        <w:trPr>
-          <w:trHeight w:val="100" w:hRule="exact"/>
-        </w:trPr>
         <w:tc>
           <w:tcPr>
-            <w:tcW w:type="dxa" w:w="4536"/>
+            <w:tcW w:w="4531" w:type="dxa"/>
           </w:tcPr>
           <w:p>
-            <w:r>
-              <w:t>{%tr for d in disorders %}</w:t>
+            <w:pPr>
+              <w:rPr>
+                <w:sz w:val="20"/>
+                <w:szCs w:val="20"/>
+              </w:rPr>
+            </w:pPr>
+            <w:r>
+              <w:rPr>
+                <w:b/>
+                <w:sz w:val="20"/>
+                <w:szCs w:val="20"/>
+              </w:rPr>
+              <w:t>Localisation :</w:t>
             </w:r>
           </w:p>
         </w:tc>
         <w:tc>
           <w:tcPr>
-            <w:tcW w:type="dxa" w:w="4536"/>
+            <w:tcW w:w="4531" w:type="dxa"/>
           </w:tcPr>
           <w:p>
-            <w:r/>
+            <w:pPr>
+              <w:rPr>
+                <w:sz w:val="20"/>
+                <w:szCs w:val="20"/>
+              </w:rPr>
+            </w:pPr>
+            <w:proofErr w:type="gramStart"/>
+            <w:r>
+              <w:rPr>
+                <w:sz w:val="20"/>
+                <w:szCs w:val="20"/>
+              </w:rPr>
+              <w:t>{{ d</w:t>
+            </w:r>
+            <w:proofErr w:type="gramEnd"/>
+            <w:r>
+              <w:rPr>
+                <w:sz w:val="20"/>
+                <w:szCs w:val="20"/>
+              </w:rPr>
+              <w:t>.location }}</w:t>
+            </w:r>
           </w:p>
         </w:tc>
       </w:tr>
       <w:tr>
         <w:tc>
           <w:tcPr>
-            <w:tcW w:type="dxa" w:w="9072"/>
-            <w:gridSpan w:val="2"/>
-            <w:shd w:val="clear" w:color="auto" w:fill="1F3A5F"/>
+            <w:tcW w:w="4531" w:type="dxa"/>
           </w:tcPr>
           <w:p>
             <w:pPr>
-              <w:jc w:val="left"/>
+              <w:rPr>
+                <w:sz w:val="20"/>
+                <w:szCs w:val="20"/>
+              </w:rPr>
             </w:pPr>
             <w:r>
               <w:rPr>
                 <w:b/>
-                <w:color w:val="FFFFFF"/>
-                <w:sz w:val="22"/>
-              </w:rPr>
-              <w:t>{{ d.ref }}</w:t>
-            </w:r>
-            <w:r>
-              <w:rPr>
-                <w:color w:val="FFFFFF"/>
-                <w:sz w:val="22"/>
-              </w:rPr>
-              <w:t xml:space="preserve">  –  </w:t>
-            </w:r>
-            <w:r>
-              <w:rPr>
-                <w:b/>
-                <w:color w:val="FFFFFF"/>
-                <w:sz w:val="22"/>
-              </w:rPr>
-              <w:t>{{ d.name }}</w:t>
+                <w:sz w:val="20"/>
+                <w:szCs w:val="20"/>
+              </w:rPr>
+              <w:t>Indice d’état :</w:t>
+            </w:r>
+          </w:p>
+        </w:tc>
+        <w:tc>
+          <w:tcPr>
+            <w:tcW w:w="4531" w:type="dxa"/>
+          </w:tcPr>
+          <w:p>
+            <w:pPr>
+              <w:rPr>
+                <w:sz w:val="20"/>
+                <w:szCs w:val="20"/>
+              </w:rPr>
+            </w:pPr>
+            <w:proofErr w:type="gramStart"/>
+            <w:r>
+              <w:rPr>
+                <w:sz w:val="20"/>
+                <w:szCs w:val="20"/>
+              </w:rPr>
+              <w:t>{{ d</w:t>
+            </w:r>
+            <w:proofErr w:type="gramEnd"/>
+            <w:r>
+              <w:rPr>
+                <w:sz w:val="20"/>
+                <w:szCs w:val="20"/>
+              </w:rPr>
+              <w:t>.ie }}</w:t>
             </w:r>
           </w:p>
         </w:tc>
@@ -3952,25 +4072,63 @@
       <w:tr>
         <w:tc>
           <w:tcPr>
-            <w:tcW w:type="dxa" w:w="4536"/>
+            <w:tcW w:w="4531" w:type="dxa"/>
+            <w:vAlign w:val="center"/>
           </w:tcPr>
           <w:p>
-            <w:r>
-              <w:rPr>
-                <w:b/>
-                <w:sz w:val="18"/>
-              </w:rPr>
-              <w:t>Localisation :</w:t>
+            <w:pPr>
+              <w:jc w:val="center"/>
+              <w:rPr>
+                <w:sz w:val="20"/>
+                <w:szCs w:val="20"/>
+              </w:rPr>
+            </w:pPr>
+            <w:proofErr w:type="gramStart"/>
+            <w:r>
+              <w:rPr>
+                <w:sz w:val="20"/>
+                <w:szCs w:val="20"/>
+              </w:rPr>
+              <w:t>{{ d</w:t>
+            </w:r>
+            <w:proofErr w:type="gramEnd"/>
+            <w:r>
+              <w:rPr>
+                <w:sz w:val="20"/>
+                <w:szCs w:val="20"/>
+              </w:rPr>
+              <w:t>.photo1 }}</w:t>
             </w:r>
           </w:p>
         </w:tc>
         <w:tc>
           <w:tcPr>
-            <w:tcW w:type="dxa" w:w="4536"/>
+            <w:tcW w:w="4531" w:type="dxa"/>
+            <w:vAlign w:val="center"/>
           </w:tcPr>
           <w:p>
-            <w:r>
-              <w:t>{{ d.location }}</w:t>
+            <w:pPr>
+              <w:jc w:val="center"/>
+              <w:rPr>
+                <w:sz w:val="20"/>
+                <w:szCs w:val="20"/>
+              </w:rPr>
+            </w:pPr>
+            <w:proofErr w:type="gramStart"/>
+            <w:r>
+              <w:rPr>
+                <w:sz w:val="20"/>
+                <w:szCs w:val="20"/>
+              </w:rPr>
+              <w:t>{{ d</w:t>
+            </w:r>
+            <w:proofErr w:type="gramEnd"/>
+            <w:r>
+              <w:rPr>
+                <w:sz w:val="20"/>
+                <w:szCs w:val="20"/>
+              </w:rPr>
+              <w:t>.photo2 }}</w:t>
             </w:r>
           </w:p>
         </w:tc>
@@ -3978,25 +4136,63 @@
       <w:tr>
         <w:tc>
           <w:tcPr>
-            <w:tcW w:type="dxa" w:w="4536"/>
+            <w:tcW w:w="4531" w:type="dxa"/>
+            <w:vAlign w:val="center"/>
           </w:tcPr>
           <w:p>
-            <w:r>
-              <w:rPr>
-                <w:b/>
-                <w:sz w:val="18"/>
-              </w:rPr>
-              <w:t>Indice d’état :</w:t>
+            <w:pPr>
+              <w:jc w:val="center"/>
+              <w:rPr>
+                <w:sz w:val="20"/>
+                <w:szCs w:val="20"/>
+              </w:rPr>
+            </w:pPr>
+            <w:proofErr w:type="gramStart"/>
+            <w:r>
+              <w:rPr>
+                <w:sz w:val="20"/>
+                <w:szCs w:val="20"/>
+              </w:rPr>
+              <w:t>{{ d</w:t>
+            </w:r>
+            <w:proofErr w:type="gramEnd"/>
+            <w:r>
+              <w:rPr>
+                <w:sz w:val="20"/>
+                <w:szCs w:val="20"/>
+              </w:rPr>
+              <w:t>.photo3 }}</w:t>
             </w:r>
           </w:p>
         </w:tc>
         <w:tc>
           <w:tcPr>
-            <w:tcW w:type="dxa" w:w="4536"/>
+            <w:tcW w:w="4531" w:type="dxa"/>
+            <w:vAlign w:val="center"/>
           </w:tcPr>
           <w:p>
-            <w:r>
-              <w:t>{{ d.ie }}</w:t>
+            <w:pPr>
+              <w:jc w:val="center"/>
+              <w:rPr>
+                <w:sz w:val="20"/>
+                <w:szCs w:val="20"/>
+              </w:rPr>
+            </w:pPr>
+            <w:proofErr w:type="gramStart"/>
+            <w:r>
+              <w:rPr>
+                <w:sz w:val="20"/>
+                <w:szCs w:val="20"/>
+              </w:rPr>
+              <w:t>{{ d</w:t>
+            </w:r>
+            <w:proofErr w:type="gramEnd"/>
+            <w:r>
+              <w:rPr>
+                <w:sz w:val="20"/>
+                <w:szCs w:val="20"/>
+              </w:rPr>
+              <w:t>.photo4 }}</w:t>
             </w:r>
           </w:p>
         </w:tc>
@@ -4004,21 +4200,51 @@
       <w:tr>
         <w:tc>
           <w:tcPr>
-            <w:tcW w:type="dxa" w:w="4536"/>
+            <w:tcW w:w="4531" w:type="dxa"/>
           </w:tcPr>
           <w:p>
-            <w:r>
-              <w:t>{{ d.photo1 }}</w:t>
+            <w:pPr>
+              <w:rPr>
+                <w:sz w:val="20"/>
+                <w:szCs w:val="20"/>
+              </w:rPr>
+            </w:pPr>
+            <w:r>
+              <w:rPr>
+                <w:b/>
+                <w:sz w:val="20"/>
+                <w:szCs w:val="20"/>
+              </w:rPr>
+              <w:t>Description :</w:t>
             </w:r>
           </w:p>
         </w:tc>
         <w:tc>
           <w:tcPr>
-            <w:tcW w:type="dxa" w:w="4536"/>
+            <w:tcW w:w="4531" w:type="dxa"/>
           </w:tcPr>
           <w:p>
-            <w:r>
-              <w:t>{{ d.photo2 }}</w:t>
+            <w:pPr>
+              <w:rPr>
+                <w:sz w:val="20"/>
+                <w:szCs w:val="20"/>
+              </w:rPr>
+            </w:pPr>
+            <w:proofErr w:type="gramStart"/>
+            <w:r>
+              <w:rPr>
+                <w:sz w:val="20"/>
+                <w:szCs w:val="20"/>
+              </w:rPr>
+              <w:t>{{ d</w:t>
+            </w:r>
+            <w:proofErr w:type="gramEnd"/>
+            <w:r>
+              <w:rPr>
+                <w:sz w:val="20"/>
+                <w:szCs w:val="20"/>
+              </w:rPr>
+              <w:t>.description }}</w:t>
             </w:r>
           </w:p>
         </w:tc>
@@ -4026,21 +4252,51 @@
       <w:tr>
         <w:tc>
           <w:tcPr>
-            <w:tcW w:type="dxa" w:w="4536"/>
+            <w:tcW w:w="4531" w:type="dxa"/>
           </w:tcPr>
           <w:p>
-            <w:r>
-              <w:t>{{ d.photo3 }}</w:t>
+            <w:pPr>
+              <w:rPr>
+                <w:sz w:val="20"/>
+                <w:szCs w:val="20"/>
+              </w:rPr>
+            </w:pPr>
+            <w:r>
+              <w:rPr>
+                <w:b/>
+                <w:sz w:val="20"/>
+                <w:szCs w:val="20"/>
+              </w:rPr>
+              <w:t>Cause probable :</w:t>
             </w:r>
           </w:p>
         </w:tc>
         <w:tc>
           <w:tcPr>
-            <w:tcW w:type="dxa" w:w="4536"/>
+            <w:tcW w:w="4531" w:type="dxa"/>
           </w:tcPr>
           <w:p>
-            <w:r>
-              <w:t>{{ d.photo4 }}</w:t>
+            <w:pPr>
+              <w:rPr>
+                <w:sz w:val="20"/>
+                <w:szCs w:val="20"/>
+              </w:rPr>
+            </w:pPr>
+            <w:proofErr w:type="gramStart"/>
+            <w:r>
+              <w:rPr>
+                <w:sz w:val="20"/>
+                <w:szCs w:val="20"/>
+              </w:rPr>
+              <w:t>{{ d</w:t>
+            </w:r>
+            <w:proofErr w:type="gramEnd"/>
+            <w:r>
+              <w:rPr>
+                <w:sz w:val="20"/>
+                <w:szCs w:val="20"/>
+              </w:rPr>
+              <w:t>.cause }}</w:t>
             </w:r>
           </w:p>
         </w:tc>
@@ -4048,127 +4304,89 @@
       <w:tr>
         <w:tc>
           <w:tcPr>
-            <w:tcW w:type="dxa" w:w="4536"/>
+            <w:tcW w:w="4531" w:type="dxa"/>
           </w:tcPr>
           <w:p>
+            <w:pPr>
+              <w:rPr>
+                <w:sz w:val="20"/>
+                <w:szCs w:val="20"/>
+              </w:rPr>
+            </w:pPr>
             <w:r>
               <w:rPr>
                 <w:b/>
-                <w:sz w:val="18"/>
-              </w:rPr>
-              <w:t>Description :</w:t>
+                <w:sz w:val="20"/>
+                <w:szCs w:val="20"/>
+              </w:rPr>
+              <w:t>Recommandations :</w:t>
             </w:r>
           </w:p>
         </w:tc>
         <w:tc>
           <w:tcPr>
-            <w:tcW w:type="dxa" w:w="4536"/>
+            <w:tcW w:w="4531" w:type="dxa"/>
           </w:tcPr>
           <w:p>
-            <w:r>
-              <w:t>{{ d.description }}</w:t>
-            </w:r>
-          </w:p>
-        </w:tc>
-      </w:tr>
-      <w:tr>
-        <w:tc>
-          <w:tcPr>
-            <w:tcW w:type="dxa" w:w="4536"/>
-          </w:tcPr>
-          <w:p>
-            <w:r>
-              <w:rPr>
-                <w:b/>
-                <w:sz w:val="18"/>
-              </w:rPr>
-              <w:t>Cause probable :</w:t>
-            </w:r>
-          </w:p>
-        </w:tc>
-        <w:tc>
-          <w:tcPr>
-            <w:tcW w:type="dxa" w:w="4536"/>
-          </w:tcPr>
-          <w:p>
-            <w:r>
-              <w:t>{{ d.cause }}</w:t>
-            </w:r>
-          </w:p>
-        </w:tc>
-      </w:tr>
-      <w:tr>
-        <w:tc>
-          <w:tcPr>
-            <w:tcW w:type="dxa" w:w="4536"/>
-          </w:tcPr>
-          <w:p>
-            <w:r>
-              <w:rPr>
-                <w:b/>
-                <w:sz w:val="18"/>
-              </w:rPr>
-              <w:t>Recommandations :</w:t>
-            </w:r>
-          </w:p>
-        </w:tc>
-        <w:tc>
-          <w:tcPr>
-            <w:tcW w:type="dxa" w:w="4536"/>
-          </w:tcPr>
-          <w:p>
-            <w:r>
-              <w:t>{{ d.recommendations }}</w:t>
-            </w:r>
-          </w:p>
-        </w:tc>
-      </w:tr>
-      <w:tr>
-        <w:trPr>
-          <w:trHeight w:val="100" w:hRule="exact"/>
-        </w:trPr>
-        <w:tc>
-          <w:tcPr>
-            <w:tcW w:type="dxa" w:w="4536"/>
-          </w:tcPr>
-          <w:p>
-            <w:r>
-              <w:t>{%tr endfor %}</w:t>
-            </w:r>
-          </w:p>
-        </w:tc>
-        <w:tc>
-          <w:tcPr>
-            <w:tcW w:type="dxa" w:w="4536"/>
-          </w:tcPr>
-          <w:p>
-            <w:r/>
+            <w:pPr>
+              <w:rPr>
+                <w:sz w:val="20"/>
+                <w:szCs w:val="20"/>
+              </w:rPr>
+            </w:pPr>
+            <w:proofErr w:type="gramStart"/>
+            <w:r>
+              <w:rPr>
+                <w:sz w:val="20"/>
+                <w:szCs w:val="20"/>
+              </w:rPr>
+              <w:t>{{ d</w:t>
+            </w:r>
+            <w:proofErr w:type="gramEnd"/>
+            <w:r>
+              <w:rPr>
+                <w:sz w:val="20"/>
+                <w:szCs w:val="20"/>
+              </w:rPr>
+              <w:t>.recommendations }}</w:t>
+            </w:r>
           </w:p>
         </w:tc>
       </w:tr>
     </w:tbl>
-    <w:p/>
     <w:p>
+      <w:r>
+        <w:t xml:space="preserve">{%tr </w:t>
+      </w:r>
+      <w:proofErr w:type="spellStart"/>
+      <w:r>
+        <w:t>endfor</w:t>
+      </w:r>
+      <w:proofErr w:type="spellEnd"/>
+      <w:r>
+        <w:t xml:space="preserve"> %}</w:t>
+      </w:r>
+    </w:p>
+    <w:p>
       <w:pPr>
         <w:pStyle w:val="Titre1"/>
-        <w:spacing w:before="48" w:after="48"/>
-      </w:pPr>
-      <w:bookmarkStart w:id="53" w:name="_Toc216726479"/>
+      </w:pPr>
+      <w:bookmarkStart w:id="51" w:name="_Toc216726479"/>
       <w:r>
         <w:lastRenderedPageBreak/>
         <w:t>Synthèse et recommandations</w:t>
       </w:r>
-      <w:bookmarkEnd w:id="53"/>
+      <w:bookmarkEnd w:id="51"/>
     </w:p>
     <w:p>
       <w:pPr>
         <w:pStyle w:val="Titre2"/>
       </w:pPr>
-      <w:bookmarkStart w:id="54" w:name="_Toc216726480"/>
+      <w:bookmarkStart w:id="52" w:name="_Toc216726480"/>
       <w:r>
         <w:t>Conclusions</w:t>
       </w:r>
-      <w:bookmarkEnd w:id="54"/>
+      <w:bookmarkEnd w:id="52"/>
     </w:p>
     <w:p>
       <w:pPr>
@@ -4187,11 +4405,11 @@
       <w:pPr>
         <w:pStyle w:val="Titre2"/>
       </w:pPr>
-      <w:bookmarkStart w:id="55" w:name="_Toc216726481"/>
+      <w:bookmarkStart w:id="53" w:name="_Toc216726481"/>
       <w:r>
         <w:t>Recommandations</w:t>
       </w:r>
-      <w:bookmarkEnd w:id="55"/>
+      <w:bookmarkEnd w:id="53"/>
     </w:p>
     <w:p>
       <w:pPr>
@@ -4224,17 +4442,16 @@
     <w:p>
       <w:pPr>
         <w:pStyle w:val="ANNEXES"/>
-        <w:spacing w:before="48" w:after="48"/>
       </w:pPr>
       <w:r>
         <w:lastRenderedPageBreak/>
         <w:t> </w:t>
       </w:r>
-      <w:bookmarkStart w:id="56" w:name="_Toc216726482"/>
+      <w:bookmarkStart w:id="54" w:name="_Toc216726482"/>
       <w:r>
         <w:t>Attestation d’assurance</w:t>
       </w:r>
-      <w:bookmarkEnd w:id="56"/>
+      <w:bookmarkEnd w:id="54"/>
     </w:p>
     <w:p>
       <w:r>
@@ -4327,6 +4544,9 @@
   <w:p>
     <w:pPr>
       <w:pStyle w:val="Pieddepage"/>
+      <w:pBdr>
+        <w:top w:val="single" w:sz="4" w:space="1" w:color="auto"/>
+      </w:pBdr>
       <w:jc w:val="center"/>
     </w:pPr>
     <w:r>
@@ -4641,6 +4861,118 @@
     </w:lvl>
   </w:abstractNum>
   <w:abstractNum w:abstractNumId="2" w15:restartNumberingAfterBreak="0">
+    <w:nsid w:val="05F774B6"/>
+    <w:multiLevelType w:val="hybridMultilevel"/>
+    <w:tmpl w:val="6F94F4AA"/>
+    <w:lvl w:ilvl="0" w:tplc="5AC80476">
+      <w:numFmt w:val="bullet"/>
+      <w:lvlText w:val=""/>
+      <w:lvlJc w:val="left"/>
+      <w:pPr>
+        <w:ind w:left="720" w:hanging="360"/>
+      </w:pPr>
+      <w:rPr>
+        <w:rFonts w:ascii="Wingdings" w:eastAsia="Times New Roman" w:hAnsi="Wingdings" w:cs="Times New Roman" w:hint="default"/>
+      </w:rPr>
+    </w:lvl>
+    <w:lvl w:ilvl="1" w:tplc="040C0003" w:tentative="1">
+      <w:start w:val="1"/>
+      <w:numFmt w:val="bullet"/>
+      <w:lvlText w:val="o"/>
+      <w:lvlJc w:val="left"/>
+      <w:pPr>
+        <w:ind w:left="1440" w:hanging="360"/>
+      </w:pPr>
+      <w:rPr>
+        <w:rFonts w:ascii="Courier New" w:hAnsi="Courier New" w:cs="Courier New" w:hint="default"/>
+      </w:rPr>
+    </w:lvl>
+    <w:lvl w:ilvl="2" w:tplc="040C0005" w:tentative="1">
+      <w:start w:val="1"/>
+      <w:numFmt w:val="bullet"/>
+      <w:lvlText w:val=""/>
+      <w:lvlJc w:val="left"/>
+      <w:pPr>
+        <w:ind w:left="2160" w:hanging="360"/>
+      </w:pPr>
+      <w:rPr>
+        <w:rFonts w:ascii="Wingdings" w:hAnsi="Wingdings" w:hint="default"/>
+      </w:rPr>
+    </w:lvl>
+    <w:lvl w:ilvl="3" w:tplc="040C0001" w:tentative="1">
+      <w:start w:val="1"/>
+      <w:numFmt w:val="bullet"/>
+      <w:lvlText w:val=""/>
+      <w:lvlJc w:val="left"/>
+      <w:pPr>
+        <w:ind w:left="2880" w:hanging="360"/>
+      </w:pPr>
+      <w:rPr>
+        <w:rFonts w:ascii="Symbol" w:hAnsi="Symbol" w:hint="default"/>
+      </w:rPr>
+    </w:lvl>
+    <w:lvl w:ilvl="4" w:tplc="040C0003" w:tentative="1">
+      <w:start w:val="1"/>
+      <w:numFmt w:val="bullet"/>
+      <w:lvlText w:val="o"/>
+      <w:lvlJc w:val="left"/>
+      <w:pPr>
+        <w:ind w:left="3600" w:hanging="360"/>
+      </w:pPr>
+      <w:rPr>
+        <w:rFonts w:ascii="Courier New" w:hAnsi="Courier New" w:cs="Courier New" w:hint="default"/>
+      </w:rPr>
+    </w:lvl>
+    <w:lvl w:ilvl="5" w:tplc="040C0005" w:tentative="1">
+      <w:start w:val="1"/>
+      <w:numFmt w:val="bullet"/>
+      <w:lvlText w:val=""/>
+      <w:lvlJc w:val="left"/>
+      <w:pPr>
+        <w:ind w:left="4320" w:hanging="360"/>
+      </w:pPr>
+      <w:rPr>
+        <w:rFonts w:ascii="Wingdings" w:hAnsi="Wingdings" w:hint="default"/>
+      </w:rPr>
+    </w:lvl>
+    <w:lvl w:ilvl="6" w:tplc="040C0001" w:tentative="1">
+      <w:start w:val="1"/>
+      <w:numFmt w:val="bullet"/>
+      <w:lvlText w:val=""/>
+      <w:lvlJc w:val="left"/>
+      <w:pPr>
+        <w:ind w:left="5040" w:hanging="360"/>
+      </w:pPr>
+      <w:rPr>
+        <w:rFonts w:ascii="Symbol" w:hAnsi="Symbol" w:hint="default"/>
+      </w:rPr>
+    </w:lvl>
+    <w:lvl w:ilvl="7" w:tplc="040C0003" w:tentative="1">
+      <w:start w:val="1"/>
+      <w:numFmt w:val="bullet"/>
+      <w:lvlText w:val="o"/>
+      <w:lvlJc w:val="left"/>
+      <w:pPr>
+        <w:ind w:left="5760" w:hanging="360"/>
+      </w:pPr>
+      <w:rPr>
+        <w:rFonts w:ascii="Courier New" w:hAnsi="Courier New" w:cs="Courier New" w:hint="default"/>
+      </w:rPr>
+    </w:lvl>
+    <w:lvl w:ilvl="8" w:tplc="040C0005" w:tentative="1">
+      <w:start w:val="1"/>
+      <w:numFmt w:val="bullet"/>
+      <w:lvlText w:val=""/>
+      <w:lvlJc w:val="left"/>
+      <w:pPr>
+        <w:ind w:left="6480" w:hanging="360"/>
+      </w:pPr>
+      <w:rPr>
+        <w:rFonts w:ascii="Wingdings" w:hAnsi="Wingdings" w:hint="default"/>
+      </w:rPr>
+    </w:lvl>
+  </w:abstractNum>
+  <w:abstractNum w:abstractNumId="3" w15:restartNumberingAfterBreak="0">
     <w:nsid w:val="0B2370B8"/>
     <w:multiLevelType w:val="hybridMultilevel"/>
     <w:tmpl w:val="8918CBFE"/>
@@ -4730,7 +5062,7 @@
       </w:pPr>
     </w:lvl>
   </w:abstractNum>
-  <w:abstractNum w:abstractNumId="3" w15:restartNumberingAfterBreak="0">
+  <w:abstractNum w:abstractNumId="4" w15:restartNumberingAfterBreak="0">
     <w:nsid w:val="0E8B2B52"/>
     <w:multiLevelType w:val="multilevel"/>
     <w:tmpl w:val="50EA846C"/>
@@ -4879,7 +5211,7 @@
       </w:rPr>
     </w:lvl>
   </w:abstractNum>
-  <w:abstractNum w:abstractNumId="4" w15:restartNumberingAfterBreak="0">
+  <w:abstractNum w:abstractNumId="5" w15:restartNumberingAfterBreak="0">
     <w:nsid w:val="243257FA"/>
     <w:multiLevelType w:val="multilevel"/>
     <w:tmpl w:val="2AD20F84"/>
@@ -5020,7 +5352,7 @@
       </w:rPr>
     </w:lvl>
   </w:abstractNum>
-  <w:abstractNum w:abstractNumId="5" w15:restartNumberingAfterBreak="0">
+  <w:abstractNum w:abstractNumId="6" w15:restartNumberingAfterBreak="0">
     <w:nsid w:val="297232EF"/>
     <w:multiLevelType w:val="multilevel"/>
     <w:tmpl w:val="91145940"/>
@@ -5133,7 +5465,7 @@
       </w:pPr>
     </w:lvl>
   </w:abstractNum>
-  <w:abstractNum w:abstractNumId="6" w15:restartNumberingAfterBreak="0">
+  <w:abstractNum w:abstractNumId="7" w15:restartNumberingAfterBreak="0">
     <w:nsid w:val="2C2E0ED0"/>
     <w:multiLevelType w:val="multilevel"/>
     <w:tmpl w:val="D0BEC7A6"/>
@@ -5282,7 +5614,7 @@
       </w:rPr>
     </w:lvl>
   </w:abstractNum>
-  <w:abstractNum w:abstractNumId="7" w15:restartNumberingAfterBreak="0">
+  <w:abstractNum w:abstractNumId="8" w15:restartNumberingAfterBreak="0">
     <w:nsid w:val="2E4710B1"/>
     <w:multiLevelType w:val="multilevel"/>
     <w:tmpl w:val="299CCA2E"/>
@@ -5399,7 +5731,7 @@
       </w:pPr>
     </w:lvl>
   </w:abstractNum>
-  <w:abstractNum w:abstractNumId="8" w15:restartNumberingAfterBreak="0">
+  <w:abstractNum w:abstractNumId="9" w15:restartNumberingAfterBreak="0">
     <w:nsid w:val="2EA36411"/>
     <w:multiLevelType w:val="multilevel"/>
     <w:tmpl w:val="3B0E0064"/>
@@ -5548,7 +5880,7 @@
       </w:rPr>
     </w:lvl>
   </w:abstractNum>
-  <w:abstractNum w:abstractNumId="9" w15:restartNumberingAfterBreak="0">
+  <w:abstractNum w:abstractNumId="10" w15:restartNumberingAfterBreak="0">
     <w:nsid w:val="32CB45A2"/>
     <w:multiLevelType w:val="multilevel"/>
     <w:tmpl w:val="040C001D"/>
@@ -5635,7 +5967,7 @@
       </w:pPr>
     </w:lvl>
   </w:abstractNum>
-  <w:abstractNum w:abstractNumId="10" w15:restartNumberingAfterBreak="0">
+  <w:abstractNum w:abstractNumId="11" w15:restartNumberingAfterBreak="0">
     <w:nsid w:val="3A370653"/>
     <w:multiLevelType w:val="multilevel"/>
     <w:tmpl w:val="90440FF0"/>
@@ -5756,7 +6088,7 @@
       </w:pPr>
     </w:lvl>
   </w:abstractNum>
-  <w:abstractNum w:abstractNumId="11" w15:restartNumberingAfterBreak="0">
+  <w:abstractNum w:abstractNumId="12" w15:restartNumberingAfterBreak="0">
     <w:nsid w:val="469D3527"/>
     <w:multiLevelType w:val="multilevel"/>
     <w:tmpl w:val="AA2E4950"/>
@@ -5905,7 +6237,7 @@
       </w:rPr>
     </w:lvl>
   </w:abstractNum>
-  <w:abstractNum w:abstractNumId="12" w15:restartNumberingAfterBreak="0">
+  <w:abstractNum w:abstractNumId="13" w15:restartNumberingAfterBreak="0">
     <w:nsid w:val="4A002706"/>
     <w:multiLevelType w:val="multilevel"/>
     <w:tmpl w:val="A4F026C4"/>
@@ -6054,7 +6386,7 @@
       </w:rPr>
     </w:lvl>
   </w:abstractNum>
-  <w:abstractNum w:abstractNumId="13" w15:restartNumberingAfterBreak="0">
+  <w:abstractNum w:abstractNumId="14" w15:restartNumberingAfterBreak="0">
     <w:nsid w:val="4E282573"/>
     <w:multiLevelType w:val="multilevel"/>
     <w:tmpl w:val="E2380D10"/>
@@ -6203,7 +6535,7 @@
       </w:rPr>
     </w:lvl>
   </w:abstractNum>
-  <w:abstractNum w:abstractNumId="14" w15:restartNumberingAfterBreak="0">
+  <w:abstractNum w:abstractNumId="15" w15:restartNumberingAfterBreak="0">
     <w:nsid w:val="5417456F"/>
     <w:multiLevelType w:val="multilevel"/>
     <w:tmpl w:val="E6864F6E"/>
@@ -6352,7 +6684,7 @@
       </w:rPr>
     </w:lvl>
   </w:abstractNum>
-  <w:abstractNum w:abstractNumId="15" w15:restartNumberingAfterBreak="0">
+  <w:abstractNum w:abstractNumId="16" w15:restartNumberingAfterBreak="0">
     <w:nsid w:val="5A774729"/>
     <w:multiLevelType w:val="multilevel"/>
     <w:tmpl w:val="773A8602"/>
@@ -6501,7 +6833,7 @@
       </w:rPr>
     </w:lvl>
   </w:abstractNum>
-  <w:abstractNum w:abstractNumId="16" w15:restartNumberingAfterBreak="0">
+  <w:abstractNum w:abstractNumId="17" w15:restartNumberingAfterBreak="0">
     <w:nsid w:val="5BA91F70"/>
     <w:multiLevelType w:val="multilevel"/>
     <w:tmpl w:val="9E92CDDE"/>
@@ -6650,7 +6982,7 @@
       </w:rPr>
     </w:lvl>
   </w:abstractNum>
-  <w:abstractNum w:abstractNumId="17" w15:restartNumberingAfterBreak="0">
+  <w:abstractNum w:abstractNumId="18" w15:restartNumberingAfterBreak="0">
     <w:nsid w:val="5CD06BB4"/>
     <w:multiLevelType w:val="multilevel"/>
     <w:tmpl w:val="5178EEC0"/>
@@ -6799,7 +7131,7 @@
       </w:rPr>
     </w:lvl>
   </w:abstractNum>
-  <w:abstractNum w:abstractNumId="18" w15:restartNumberingAfterBreak="0">
+  <w:abstractNum w:abstractNumId="19" w15:restartNumberingAfterBreak="0">
     <w:nsid w:val="5F2D0656"/>
     <w:multiLevelType w:val="multilevel"/>
     <w:tmpl w:val="85B4BECA"/>
@@ -6948,7 +7280,7 @@
       </w:rPr>
     </w:lvl>
   </w:abstractNum>
-  <w:abstractNum w:abstractNumId="19" w15:restartNumberingAfterBreak="0">
+  <w:abstractNum w:abstractNumId="20" w15:restartNumberingAfterBreak="0">
     <w:nsid w:val="60501579"/>
     <w:multiLevelType w:val="multilevel"/>
     <w:tmpl w:val="FEC8CD5E"/>
@@ -7097,7 +7429,7 @@
       </w:rPr>
     </w:lvl>
   </w:abstractNum>
-  <w:abstractNum w:abstractNumId="20" w15:restartNumberingAfterBreak="0">
+  <w:abstractNum w:abstractNumId="21" w15:restartNumberingAfterBreak="0">
     <w:nsid w:val="61EB4C22"/>
     <w:multiLevelType w:val="multilevel"/>
     <w:tmpl w:val="EAF8D3C0"/>
@@ -7246,7 +7578,7 @@
       </w:rPr>
     </w:lvl>
   </w:abstractNum>
-  <w:abstractNum w:abstractNumId="21" w15:restartNumberingAfterBreak="0">
+  <w:abstractNum w:abstractNumId="22" w15:restartNumberingAfterBreak="0">
     <w:nsid w:val="71F92692"/>
     <w:multiLevelType w:val="multilevel"/>
     <w:tmpl w:val="DD9681C2"/>
@@ -7395,10 +7727,10 @@
       </w:rPr>
     </w:lvl>
   </w:abstractNum>
-  <w:abstractNum w:abstractNumId="22" w15:restartNumberingAfterBreak="0">
+  <w:abstractNum w:abstractNumId="23" w15:restartNumberingAfterBreak="0">
     <w:nsid w:val="748024B0"/>
     <w:multiLevelType w:val="multilevel"/>
-    <w:tmpl w:val="ADFAE944"/>
+    <w:tmpl w:val="6ED07FBC"/>
     <w:lvl w:ilvl="0">
       <w:start w:val="1"/>
       <w:numFmt w:val="decimal"/>
@@ -7490,7 +7822,7 @@
       </w:pPr>
     </w:lvl>
   </w:abstractNum>
-  <w:abstractNum w:abstractNumId="23" w15:restartNumberingAfterBreak="0">
+  <w:abstractNum w:abstractNumId="24" w15:restartNumberingAfterBreak="0">
     <w:nsid w:val="768A5F3A"/>
     <w:multiLevelType w:val="multilevel"/>
     <w:tmpl w:val="1360A396"/>
@@ -7580,7 +7912,7 @@
       </w:pPr>
     </w:lvl>
   </w:abstractNum>
-  <w:abstractNum w:abstractNumId="24" w15:restartNumberingAfterBreak="0">
+  <w:abstractNum w:abstractNumId="25" w15:restartNumberingAfterBreak="0">
     <w:nsid w:val="796565DD"/>
     <w:multiLevelType w:val="multilevel"/>
     <w:tmpl w:val="19D0901C"/>
@@ -7725,7 +8057,7 @@
       </w:rPr>
     </w:lvl>
   </w:abstractNum>
-  <w:abstractNum w:abstractNumId="25" w15:restartNumberingAfterBreak="0">
+  <w:abstractNum w:abstractNumId="26" w15:restartNumberingAfterBreak="0">
     <w:nsid w:val="7A4C7E94"/>
     <w:multiLevelType w:val="multilevel"/>
     <w:tmpl w:val="FB16FFAA"/>
@@ -7841,7 +8173,7 @@
       </w:pPr>
     </w:lvl>
   </w:abstractNum>
-  <w:abstractNum w:abstractNumId="26" w15:restartNumberingAfterBreak="0">
+  <w:abstractNum w:abstractNumId="27" w15:restartNumberingAfterBreak="0">
     <w:nsid w:val="7CA5099C"/>
     <w:multiLevelType w:val="hybridMultilevel"/>
     <w:tmpl w:val="518AB462"/>
@@ -7955,88 +8287,91 @@
     </w:lvl>
   </w:abstractNum>
   <w:num w:numId="1" w16cid:durableId="1543398452">
-    <w:abstractNumId w:val="4"/>
+    <w:abstractNumId w:val="5"/>
   </w:num>
   <w:num w:numId="2" w16cid:durableId="453065134">
     <w:abstractNumId w:val="1"/>
   </w:num>
   <w:num w:numId="3" w16cid:durableId="934938435">
+    <w:abstractNumId w:val="16"/>
+  </w:num>
+  <w:num w:numId="4" w16cid:durableId="2057390977">
+    <w:abstractNumId w:val="12"/>
+  </w:num>
+  <w:num w:numId="5" w16cid:durableId="518547046">
+    <w:abstractNumId w:val="17"/>
+  </w:num>
+  <w:num w:numId="6" w16cid:durableId="1555382980">
+    <w:abstractNumId w:val="18"/>
+  </w:num>
+  <w:num w:numId="7" w16cid:durableId="1342775370">
+    <w:abstractNumId w:val="26"/>
+  </w:num>
+  <w:num w:numId="8" w16cid:durableId="513154742">
+    <w:abstractNumId w:val="23"/>
+  </w:num>
+  <w:num w:numId="9" w16cid:durableId="444734033">
+    <w:abstractNumId w:val="9"/>
+  </w:num>
+  <w:num w:numId="10" w16cid:durableId="1491747888">
+    <w:abstractNumId w:val="11"/>
+  </w:num>
+  <w:num w:numId="11" w16cid:durableId="1224564590">
+    <w:abstractNumId w:val="4"/>
+  </w:num>
+  <w:num w:numId="12" w16cid:durableId="1114207215">
+    <w:abstractNumId w:val="13"/>
+  </w:num>
+  <w:num w:numId="13" w16cid:durableId="41372084">
+    <w:abstractNumId w:val="19"/>
+  </w:num>
+  <w:num w:numId="14" w16cid:durableId="1980647119">
+    <w:abstractNumId w:val="21"/>
+  </w:num>
+  <w:num w:numId="15" w16cid:durableId="1990089469">
+    <w:abstractNumId w:val="8"/>
+  </w:num>
+  <w:num w:numId="16" w16cid:durableId="1293511494">
+    <w:abstractNumId w:val="10"/>
+  </w:num>
+  <w:num w:numId="17" w16cid:durableId="2068257723">
+    <w:abstractNumId w:val="3"/>
+  </w:num>
+  <w:num w:numId="18" w16cid:durableId="159395935">
+    <w:abstractNumId w:val="24"/>
+  </w:num>
+  <w:num w:numId="19" w16cid:durableId="1182547042">
+    <w:abstractNumId w:val="22"/>
+  </w:num>
+  <w:num w:numId="20" w16cid:durableId="351956329">
+    <w:abstractNumId w:val="25"/>
+  </w:num>
+  <w:num w:numId="21" w16cid:durableId="905916314">
+    <w:abstractNumId w:val="14"/>
+  </w:num>
+  <w:num w:numId="22" w16cid:durableId="1246762496">
     <w:abstractNumId w:val="15"/>
   </w:num>
-  <w:num w:numId="4" w16cid:durableId="2057390977">
-    <w:abstractNumId w:val="11"/>
-  </w:num>
-  <w:num w:numId="5" w16cid:durableId="518547046">
-    <w:abstractNumId w:val="16"/>
-  </w:num>
-  <w:num w:numId="6" w16cid:durableId="1555382980">
-    <w:abstractNumId w:val="17"/>
-  </w:num>
-  <w:num w:numId="7" w16cid:durableId="1342775370">
-    <w:abstractNumId w:val="25"/>
-  </w:num>
-  <w:num w:numId="8" w16cid:durableId="513154742">
-    <w:abstractNumId w:val="22"/>
-  </w:num>
-  <w:num w:numId="9" w16cid:durableId="444734033">
-    <w:abstractNumId w:val="8"/>
-  </w:num>
-  <w:num w:numId="10" w16cid:durableId="1491747888">
-    <w:abstractNumId w:val="10"/>
-  </w:num>
-  <w:num w:numId="11" w16cid:durableId="1224564590">
-    <w:abstractNumId w:val="3"/>
-  </w:num>
-  <w:num w:numId="12" w16cid:durableId="1114207215">
-    <w:abstractNumId w:val="12"/>
-  </w:num>
-  <w:num w:numId="13" w16cid:durableId="41372084">
-    <w:abstractNumId w:val="18"/>
-  </w:num>
-  <w:num w:numId="14" w16cid:durableId="1980647119">
-    <w:abstractNumId w:val="20"/>
-  </w:num>
-  <w:num w:numId="15" w16cid:durableId="1990089469">
+  <w:num w:numId="23" w16cid:durableId="1329141247">
     <w:abstractNumId w:val="7"/>
   </w:num>
-  <w:num w:numId="16" w16cid:durableId="1293511494">
-    <w:abstractNumId w:val="9"/>
+  <w:num w:numId="24" w16cid:durableId="579294113">
+    <w:abstractNumId w:val="27"/>
   </w:num>
-  <w:num w:numId="17" w16cid:durableId="2068257723">
-    <w:abstractNumId w:val="2"/>
+  <w:num w:numId="25" w16cid:durableId="950479186">
+    <w:abstractNumId w:val="6"/>
   </w:num>
-  <w:num w:numId="18" w16cid:durableId="159395935">
+  <w:num w:numId="26" w16cid:durableId="727843757">
     <w:abstractNumId w:val="23"/>
   </w:num>
-  <w:num w:numId="19" w16cid:durableId="1182547042">
-    <w:abstractNumId w:val="21"/>
-  </w:num>
-  <w:num w:numId="20" w16cid:durableId="351956329">
-    <w:abstractNumId w:val="24"/>
-  </w:num>
-  <w:num w:numId="21" w16cid:durableId="905916314">
-    <w:abstractNumId w:val="13"/>
-  </w:num>
-  <w:num w:numId="22" w16cid:durableId="1246762496">
-    <w:abstractNumId w:val="14"/>
-  </w:num>
-  <w:num w:numId="23" w16cid:durableId="1329141247">
-    <w:abstractNumId w:val="6"/>
-  </w:num>
-  <w:num w:numId="24" w16cid:durableId="579294113">
-    <w:abstractNumId w:val="26"/>
-  </w:num>
-  <w:num w:numId="25" w16cid:durableId="950479186">
-    <w:abstractNumId w:val="5"/>
-  </w:num>
-  <w:num w:numId="26" w16cid:durableId="727843757">
-    <w:abstractNumId w:val="22"/>
-  </w:num>
   <w:num w:numId="27" w16cid:durableId="159397095">
-    <w:abstractNumId w:val="19"/>
+    <w:abstractNumId w:val="20"/>
   </w:num>
   <w:num w:numId="28" w16cid:durableId="1940285808">
     <w:abstractNumId w:val="0"/>
+  </w:num>
+  <w:num w:numId="29" w16cid:durableId="1762604953">
+    <w:abstractNumId w:val="2"/>
   </w:num>
   <w:numIdMacAtCleanup w:val="25"/>
 </w:numbering>
@@ -8460,7 +8795,7 @@
     <w:link w:val="Titre1Car"/>
     <w:uiPriority w:val="9"/>
     <w:qFormat/>
-    <w:rsid w:val="0044580A"/>
+    <w:rsid w:val="0097297F"/>
     <w:pPr>
       <w:keepNext/>
       <w:keepLines/>
@@ -8468,7 +8803,7 @@
       <w:numPr>
         <w:numId w:val="8"/>
       </w:numPr>
-      <w:spacing w:before="360" w:after="80"/>
+      <w:spacing w:before="80" w:after="80"/>
       <w:ind w:left="431" w:hanging="431"/>
       <w:outlineLvl w:val="0"/>
     </w:pPr>
@@ -8716,12 +9051,15 @@
     <w:basedOn w:val="Policepardfaut"/>
     <w:link w:val="Titre1"/>
     <w:uiPriority w:val="9"/>
-    <w:rsid w:val="0044580A"/>
+    <w:rsid w:val="0097297F"/>
     <w:rPr>
       <w:rFonts w:asciiTheme="majorHAnsi" w:eastAsiaTheme="majorEastAsia" w:hAnsiTheme="majorHAnsi" w:cstheme="majorBidi"/>
       <w:color w:val="0F4761" w:themeColor="accent1" w:themeShade="BF"/>
+      <w:kern w:val="0"/>
       <w:sz w:val="40"/>
       <w:szCs w:val="40"/>
+      <w:lang w:eastAsia="fr-FR"/>
+      <w14:ligatures w14:val="none"/>
     </w:rPr>
   </w:style>
   <w:style w:type="character" w:customStyle="1" w:styleId="Titre2Car">
@@ -9687,6 +10025,18 @@
       <w14:ligatures w14:val="none"/>
     </w:rPr>
   </w:style>
+  <w:style w:type="character" w:styleId="Lienhypertextesuivivisit">
+    <w:name w:val="FollowedHyperlink"/>
+    <w:basedOn w:val="Policepardfaut"/>
+    <w:uiPriority w:val="99"/>
+    <w:semiHidden/>
+    <w:unhideWhenUsed/>
+    <w:rsid w:val="00A65FC7"/>
+    <w:rPr>
+      <w:color w:val="96607D" w:themeColor="followedHyperlink"/>
+      <w:u w:val="single"/>
+    </w:rPr>
+  </w:style>
 </w:styles>
 </file>
 

</xml_diff>

<commit_message>
fix: repair {%tr %} loop tags in diagnostic.docx paragraph context
User moved the disorder loop tags ({%tr for/endfor}) from table cells into
paragraphs. In docxtpl, {%tr %} only works inside table rows. Converted to
standard Jinja2 {% for d in disorders %} / {% endfor %} which works at
paragraph level and correctly repeats the heading+table block per disorder.

Co-Authored-By: Claude Sonnet 4.6 <noreply@anthropic.com>
</commit_message>
<xml_diff>
--- a/plugins/edifice-mission-report/templates/ic-ingenieurs/diagnostic.docx
+++ b/plugins/edifice-mission-report/templates/ic-ingenieurs/diagnostic.docx
@@ -3902,16 +3902,12 @@
     </w:p>
     <w:p>
       <w:r>
-        <w:t xml:space="preserve">{%tr for d in </w:t>
+        <w:t>{% for d in disorders %}</w:t>
       </w:r>
       <w:proofErr w:type="spellStart"/>
-      <w:r>
-        <w:t>disorders</w:t>
-      </w:r>
+      <w:r/>
       <w:proofErr w:type="spellEnd"/>
-      <w:r>
-        <w:t xml:space="preserve"> %}</w:t>
-      </w:r>
+      <w:r/>
     </w:p>
     <w:p>
       <w:pPr>
@@ -4356,16 +4352,12 @@
     </w:tbl>
     <w:p>
       <w:r>
-        <w:t xml:space="preserve">{%tr </w:t>
+        <w:t>{% endfor %}</w:t>
       </w:r>
       <w:proofErr w:type="spellStart"/>
-      <w:r>
-        <w:t>endfor</w:t>
-      </w:r>
+      <w:r/>
       <w:proofErr w:type="spellEnd"/>
-      <w:r>
-        <w:t xml:space="preserve"> %}</w:t>
-      </w:r>
+      <w:r/>
     </w:p>
     <w:p>
       <w:pPr>

</xml_diff>